<commit_message>
Apply brand kit to site; fix publications offset; auto-generate README
- Site now conforms to the finalized brand kit (portfolio-v2 D-008):
  Crimson Text / Libre Franklin / JetBrains Mono; blue/red/tan/petrol palette;
  sharp 2px corners; uppercase sans buttons; bordered shadowless cards; dark footer
- Fix offset Publications entry (floating timeline dot -> plain list-item)
- README is now generated from resume.json (professional, cross-linked, badges)
- CV heading cross-links Portfolio + GitHub (chain is complementary)
- CI commits README to site repo and syncs it to the 007nishan profile repo
  (guarded on PROFILE_REPO_TOKEN secret)
</commit_message>
<xml_diff>
--- a/cv/Nishanur_Rahman_CV.docx
+++ b/cv/Nishanur_Rahman_CV.docx
@@ -104,7 +104,7 @@
           </w:tcPr>
           <w:p>
             <w:pPr>
-              <w:spacing w:after="40"/>
+              <w:spacing w:after="0"/>
             </w:pPr>
             <w:r>
               <w:rPr>
@@ -128,6 +128,76 @@
           </w:tcPr>
           <w:p>
             <w:pPr>
+              <w:spacing w:after="0"/>
+              <w:jc w:val="right"/>
+            </w:pPr>
+            <w:r>
+              <w:rPr>
+                <w:i w:val="0"/>
+                <w:sz w:val="21"/>
+              </w:rPr>
+              <w:t>Mobile:  +91-885-3185-390</w:t>
+            </w:r>
+          </w:p>
+        </w:tc>
+      </w:tr>
+    </w:tbl>
+    <w:tbl>
+      <w:tblPr>
+        <w:tblW w:type="auto" w:w="0"/>
+        <w:jc w:val="left"/>
+        <w:tblLayout w:type="fixed"/>
+        <w:tblLook w:firstColumn="1" w:firstRow="1" w:lastColumn="0" w:lastRow="0" w:noHBand="0" w:noVBand="1" w:val="04A0"/>
+        <w:tblBorders>
+          <w:top w:val="none"/>
+          <w:left w:val="none"/>
+          <w:bottom w:val="none"/>
+          <w:right w:val="none"/>
+          <w:insideH w:val="none"/>
+          <w:insideV w:val="none"/>
+        </w:tblBorders>
+      </w:tblPr>
+      <w:tblGrid>
+        <w:gridCol w:w="7632"/>
+        <w:gridCol w:w="3168"/>
+      </w:tblGrid>
+      <w:tr>
+        <w:tc>
+          <w:tcPr>
+            <w:tcW w:type="dxa" w:w="7632"/>
+            <w:tcMar>
+              <w:top w:w="0" w:type="dxa"/>
+              <w:left w:w="0" w:type="dxa"/>
+              <w:bottom w:w="0" w:type="dxa"/>
+              <w:right w:w="0" w:type="dxa"/>
+            </w:tcMar>
+          </w:tcPr>
+          <w:p>
+            <w:pPr>
+              <w:spacing w:after="40"/>
+            </w:pPr>
+            <w:r>
+              <w:rPr>
+                <w:b w:val="0"/>
+                <w:i w:val="0"/>
+                <w:sz w:val="21"/>
+              </w:rPr>
+              <w:t>Portfolio: https://007nishan.github.io/</w:t>
+            </w:r>
+          </w:p>
+        </w:tc>
+        <w:tc>
+          <w:tcPr>
+            <w:tcW w:type="dxa" w:w="3168"/>
+            <w:tcMar>
+              <w:top w:w="0" w:type="dxa"/>
+              <w:left w:w="0" w:type="dxa"/>
+              <w:bottom w:w="0" w:type="dxa"/>
+              <w:right w:w="0" w:type="dxa"/>
+            </w:tcMar>
+          </w:tcPr>
+          <w:p>
+            <w:pPr>
               <w:spacing w:after="40"/>
               <w:jc w:val="right"/>
             </w:pPr>
@@ -136,7 +206,7 @@
                 <w:i w:val="0"/>
                 <w:sz w:val="21"/>
               </w:rPr>
-              <w:t>Mobile:  +91-885-3185-390</w:t>
+              <w:t>GitHub: https://github.com/007nishan</w:t>
             </w:r>
           </w:p>
         </w:tc>

</xml_diff>